<commit_message>
Especificações Funcionais (.docx) com as telas dos protótipos
Cada flow.html ganha o manifesto <script id="docx-telas"> com as telas de
cada feature e o passo que as exibe; o tema GPE ganha a classe gpe-docx, que
tira o painel de notas, o selo e os avisos da captura. O gera-docx.py passa a
achar o protótipo da feature pelo manifesto prototypes/INDEX.md quando o N3
não o aponta na ## Superfície (os N3 do GPE seguem com fidelidade n/a por
decisão de 2026-10-04). Os seis .docx de documentos/ foram regerados: as 55
funcionalidades trazem as suas telas em Telas e Protótipos, com as capturas
em cache em documentos/_prototipos/.

Co-Authored-By: Claude Opus 5.5 <noreply@anthropic.com>
Claude-Session: https://claude.ai/code/session_01S1x3FCAH3923mYsQyYeY5r
</commit_message>
<xml_diff>
--- a/documentos/Autenticacao.docx
+++ b/documentos/Autenticacao.docx
@@ -2656,6 +2656,49 @@
     </w:p>
     <w:p>
       <w:pPr>
+        <w:jc w:val="center"/>
+      </w:pPr>
+      <w:r>
+        <w:drawing>
+          <wp:inline distT="0" distB="0" distL="0" distR="0">
+            <wp:extent cx="5852160" cy="4114800"/>
+            <wp:effectExtent l="0" t="0" r="0" b="0"/>
+            <wp:docPr id="101" name="Tela de acesso"/>
+            <wp:cNvGraphicFramePr>
+              <a:graphicFrameLocks xmlns:a="http://schemas.openxmlformats.org/drawingml/2006/main" noChangeAspect="1"/>
+            </wp:cNvGraphicFramePr>
+            <a:graphic xmlns:a="http://schemas.openxmlformats.org/drawingml/2006/main">
+              <a:graphicData uri="http://schemas.openxmlformats.org/drawingml/2006/picture">
+                <pic:pic xmlns:pic="http://schemas.openxmlformats.org/drawingml/2006/picture">
+                  <pic:nvPicPr>
+                    <pic:cNvPr id="101" name="Tela de acesso"/>
+                    <pic:cNvPicPr/>
+                  </pic:nvPicPr>
+                  <pic:blipFill>
+                    <a:blip r:embed="rId21"/>
+                    <a:stretch>
+                      <a:fillRect/>
+                    </a:stretch>
+                  </pic:blipFill>
+                  <pic:spPr>
+                    <a:xfrm>
+                      <a:off x="0" y="0"/>
+                      <a:ext cx="5852160" cy="4114800"/>
+                    </a:xfrm>
+                    <a:prstGeom prst="rect">
+                      <a:avLst/>
+                    </a:prstGeom>
+                  </pic:spPr>
+                </pic:pic>
+              </a:graphicData>
+            </a:graphic>
+          </wp:inline>
+        </w:drawing>
+      </w:r>
+    </w:p>
+    <w:p>
+      <w:pPr>
+        <w:jc w:val="center"/>
         <w:rPr>
           <w:i/>
           <w:iCs/>
@@ -2670,7 +2713,26 @@
           <w:sz w:val="18"/>
           <w:szCs w:val="18"/>
         </w:rPr>
-        <w:t xml:space="preserve">Sem protótipo de tela para esta funcionalidade. Campos da funcionalidade:</w:t>
+        <w:t xml:space="preserve">Tela de acesso</w:t>
+      </w:r>
+    </w:p>
+    <w:p>
+      <w:pPr>
+        <w:rPr>
+          <w:i/>
+          <w:iCs/>
+          <w:sz w:val="18"/>
+          <w:szCs w:val="18"/>
+        </w:rPr>
+      </w:pPr>
+      <w:r>
+        <w:rPr>
+          <w:i/>
+          <w:iCs/>
+          <w:sz w:val="18"/>
+          <w:szCs w:val="18"/>
+        </w:rPr>
+        <w:t xml:space="preserve">Campos da funcionalidade:</w:t>
       </w:r>
     </w:p>
     <w:tbl>
@@ -4115,6 +4177,49 @@
     </w:p>
     <w:p>
       <w:pPr>
+        <w:jc w:val="center"/>
+      </w:pPr>
+      <w:r>
+        <w:drawing>
+          <wp:inline distT="0" distB="0" distL="0" distR="0">
+            <wp:extent cx="5852160" cy="4114800"/>
+            <wp:effectExtent l="0" t="0" r="0" b="0"/>
+            <wp:docPr id="102" name="Recuperar senha"/>
+            <wp:cNvGraphicFramePr>
+              <a:graphicFrameLocks xmlns:a="http://schemas.openxmlformats.org/drawingml/2006/main" noChangeAspect="1"/>
+            </wp:cNvGraphicFramePr>
+            <a:graphic xmlns:a="http://schemas.openxmlformats.org/drawingml/2006/main">
+              <a:graphicData uri="http://schemas.openxmlformats.org/drawingml/2006/picture">
+                <pic:pic xmlns:pic="http://schemas.openxmlformats.org/drawingml/2006/picture">
+                  <pic:nvPicPr>
+                    <pic:cNvPr id="102" name="Recuperar senha"/>
+                    <pic:cNvPicPr/>
+                  </pic:nvPicPr>
+                  <pic:blipFill>
+                    <a:blip r:embed="rId22"/>
+                    <a:stretch>
+                      <a:fillRect/>
+                    </a:stretch>
+                  </pic:blipFill>
+                  <pic:spPr>
+                    <a:xfrm>
+                      <a:off x="0" y="0"/>
+                      <a:ext cx="5852160" cy="4114800"/>
+                    </a:xfrm>
+                    <a:prstGeom prst="rect">
+                      <a:avLst/>
+                    </a:prstGeom>
+                  </pic:spPr>
+                </pic:pic>
+              </a:graphicData>
+            </a:graphic>
+          </wp:inline>
+        </w:drawing>
+      </w:r>
+    </w:p>
+    <w:p>
+      <w:pPr>
+        <w:jc w:val="center"/>
         <w:rPr>
           <w:i/>
           <w:iCs/>
@@ -4129,7 +4234,26 @@
           <w:sz w:val="18"/>
           <w:szCs w:val="18"/>
         </w:rPr>
-        <w:t xml:space="preserve">Sem protótipo de tela para esta funcionalidade. Campos da funcionalidade:</w:t>
+        <w:t xml:space="preserve">Recuperar senha</w:t>
+      </w:r>
+    </w:p>
+    <w:p>
+      <w:pPr>
+        <w:rPr>
+          <w:i/>
+          <w:iCs/>
+          <w:sz w:val="18"/>
+          <w:szCs w:val="18"/>
+        </w:rPr>
+      </w:pPr>
+      <w:r>
+        <w:rPr>
+          <w:i/>
+          <w:iCs/>
+          <w:sz w:val="18"/>
+          <w:szCs w:val="18"/>
+        </w:rPr>
+        <w:t xml:space="preserve">Campos da funcionalidade:</w:t>
       </w:r>
     </w:p>
     <w:tbl>
@@ -6001,6 +6125,49 @@
     </w:p>
     <w:p>
       <w:pPr>
+        <w:jc w:val="center"/>
+      </w:pPr>
+      <w:r>
+        <w:drawing>
+          <wp:inline distT="0" distB="0" distL="0" distR="0">
+            <wp:extent cx="5852160" cy="4114800"/>
+            <wp:effectExtent l="0" t="0" r="0" b="0"/>
+            <wp:docPr id="103" name="Alterar senha — troca obrigatória"/>
+            <wp:cNvGraphicFramePr>
+              <a:graphicFrameLocks xmlns:a="http://schemas.openxmlformats.org/drawingml/2006/main" noChangeAspect="1"/>
+            </wp:cNvGraphicFramePr>
+            <a:graphic xmlns:a="http://schemas.openxmlformats.org/drawingml/2006/main">
+              <a:graphicData uri="http://schemas.openxmlformats.org/drawingml/2006/picture">
+                <pic:pic xmlns:pic="http://schemas.openxmlformats.org/drawingml/2006/picture">
+                  <pic:nvPicPr>
+                    <pic:cNvPr id="103" name="Alterar senha — troca obrigatória"/>
+                    <pic:cNvPicPr/>
+                  </pic:nvPicPr>
+                  <pic:blipFill>
+                    <a:blip r:embed="rId23"/>
+                    <a:stretch>
+                      <a:fillRect/>
+                    </a:stretch>
+                  </pic:blipFill>
+                  <pic:spPr>
+                    <a:xfrm>
+                      <a:off x="0" y="0"/>
+                      <a:ext cx="5852160" cy="4114800"/>
+                    </a:xfrm>
+                    <a:prstGeom prst="rect">
+                      <a:avLst/>
+                    </a:prstGeom>
+                  </pic:spPr>
+                </pic:pic>
+              </a:graphicData>
+            </a:graphic>
+          </wp:inline>
+        </w:drawing>
+      </w:r>
+    </w:p>
+    <w:p>
+      <w:pPr>
+        <w:jc w:val="center"/>
         <w:rPr>
           <w:i/>
           <w:iCs/>
@@ -6015,7 +6182,88 @@
           <w:sz w:val="18"/>
           <w:szCs w:val="18"/>
         </w:rPr>
-        <w:t xml:space="preserve">Sem protótipo de tela para esta funcionalidade. Campos da funcionalidade:</w:t>
+        <w:t xml:space="preserve">Alterar senha — troca obrigatória</w:t>
+      </w:r>
+    </w:p>
+    <w:p>
+      <w:pPr>
+        <w:jc w:val="center"/>
+      </w:pPr>
+      <w:r>
+        <w:drawing>
+          <wp:inline distT="0" distB="0" distL="0" distR="0">
+            <wp:extent cx="5852160" cy="4114800"/>
+            <wp:effectExtent l="0" t="0" r="0" b="0"/>
+            <wp:docPr id="104" name="Alterar senha — troca voluntária"/>
+            <wp:cNvGraphicFramePr>
+              <a:graphicFrameLocks xmlns:a="http://schemas.openxmlformats.org/drawingml/2006/main" noChangeAspect="1"/>
+            </wp:cNvGraphicFramePr>
+            <a:graphic xmlns:a="http://schemas.openxmlformats.org/drawingml/2006/main">
+              <a:graphicData uri="http://schemas.openxmlformats.org/drawingml/2006/picture">
+                <pic:pic xmlns:pic="http://schemas.openxmlformats.org/drawingml/2006/picture">
+                  <pic:nvPicPr>
+                    <pic:cNvPr id="104" name="Alterar senha — troca voluntária"/>
+                    <pic:cNvPicPr/>
+                  </pic:nvPicPr>
+                  <pic:blipFill>
+                    <a:blip r:embed="rId24"/>
+                    <a:stretch>
+                      <a:fillRect/>
+                    </a:stretch>
+                  </pic:blipFill>
+                  <pic:spPr>
+                    <a:xfrm>
+                      <a:off x="0" y="0"/>
+                      <a:ext cx="5852160" cy="4114800"/>
+                    </a:xfrm>
+                    <a:prstGeom prst="rect">
+                      <a:avLst/>
+                    </a:prstGeom>
+                  </pic:spPr>
+                </pic:pic>
+              </a:graphicData>
+            </a:graphic>
+          </wp:inline>
+        </w:drawing>
+      </w:r>
+    </w:p>
+    <w:p>
+      <w:pPr>
+        <w:jc w:val="center"/>
+        <w:rPr>
+          <w:i/>
+          <w:iCs/>
+          <w:sz w:val="18"/>
+          <w:szCs w:val="18"/>
+        </w:rPr>
+      </w:pPr>
+      <w:r>
+        <w:rPr>
+          <w:i/>
+          <w:iCs/>
+          <w:sz w:val="18"/>
+          <w:szCs w:val="18"/>
+        </w:rPr>
+        <w:t xml:space="preserve">Alterar senha — troca voluntária</w:t>
+      </w:r>
+    </w:p>
+    <w:p>
+      <w:pPr>
+        <w:rPr>
+          <w:i/>
+          <w:iCs/>
+          <w:sz w:val="18"/>
+          <w:szCs w:val="18"/>
+        </w:rPr>
+      </w:pPr>
+      <w:r>
+        <w:rPr>
+          <w:i/>
+          <w:iCs/>
+          <w:sz w:val="18"/>
+          <w:szCs w:val="18"/>
+        </w:rPr>
+        <w:t xml:space="preserve">Campos da funcionalidade:</w:t>
       </w:r>
     </w:p>
     <w:tbl>
@@ -7501,6 +7749,49 @@
     </w:p>
     <w:p>
       <w:pPr>
+        <w:jc w:val="center"/>
+      </w:pPr>
+      <w:r>
+        <w:drawing>
+          <wp:inline distT="0" distB="0" distL="0" distR="0">
+            <wp:extent cx="5852160" cy="3200400"/>
+            <wp:effectExtent l="0" t="0" r="0" b="0"/>
+            <wp:docPr id="105" name="Tela inicial com o menu do usuário aberto"/>
+            <wp:cNvGraphicFramePr>
+              <a:graphicFrameLocks xmlns:a="http://schemas.openxmlformats.org/drawingml/2006/main" noChangeAspect="1"/>
+            </wp:cNvGraphicFramePr>
+            <a:graphic xmlns:a="http://schemas.openxmlformats.org/drawingml/2006/main">
+              <a:graphicData uri="http://schemas.openxmlformats.org/drawingml/2006/picture">
+                <pic:pic xmlns:pic="http://schemas.openxmlformats.org/drawingml/2006/picture">
+                  <pic:nvPicPr>
+                    <pic:cNvPr id="105" name="Tela inicial com o menu do usuário aberto"/>
+                    <pic:cNvPicPr/>
+                  </pic:nvPicPr>
+                  <pic:blipFill>
+                    <a:blip r:embed="rId25"/>
+                    <a:stretch>
+                      <a:fillRect/>
+                    </a:stretch>
+                  </pic:blipFill>
+                  <pic:spPr>
+                    <a:xfrm>
+                      <a:off x="0" y="0"/>
+                      <a:ext cx="5852160" cy="3200400"/>
+                    </a:xfrm>
+                    <a:prstGeom prst="rect">
+                      <a:avLst/>
+                    </a:prstGeom>
+                  </pic:spPr>
+                </pic:pic>
+              </a:graphicData>
+            </a:graphic>
+          </wp:inline>
+        </w:drawing>
+      </w:r>
+    </w:p>
+    <w:p>
+      <w:pPr>
+        <w:jc w:val="center"/>
         <w:rPr>
           <w:i/>
           <w:iCs/>
@@ -7515,7 +7806,26 @@
           <w:sz w:val="18"/>
           <w:szCs w:val="18"/>
         </w:rPr>
-        <w:t xml:space="preserve">Sem protótipo de tela para esta funcionalidade. Campos da funcionalidade:</w:t>
+        <w:t xml:space="preserve">Tela inicial com o menu do usuário aberto</w:t>
+      </w:r>
+    </w:p>
+    <w:p>
+      <w:pPr>
+        <w:rPr>
+          <w:i/>
+          <w:iCs/>
+          <w:sz w:val="18"/>
+          <w:szCs w:val="18"/>
+        </w:rPr>
+      </w:pPr>
+      <w:r>
+        <w:rPr>
+          <w:i/>
+          <w:iCs/>
+          <w:sz w:val="18"/>
+          <w:szCs w:val="18"/>
+        </w:rPr>
+        <w:t xml:space="preserve">Campos da funcionalidade:</w:t>
       </w:r>
     </w:p>
     <w:tbl>
@@ -8708,6 +9018,49 @@
     </w:p>
     <w:p>
       <w:pPr>
+        <w:jc w:val="center"/>
+      </w:pPr>
+      <w:r>
+        <w:drawing>
+          <wp:inline distT="0" distB="0" distL="0" distR="0">
+            <wp:extent cx="5852160" cy="4114800"/>
+            <wp:effectExtent l="0" t="0" r="0" b="0"/>
+            <wp:docPr id="106" name="Janela Alterar Imagem do Perfil"/>
+            <wp:cNvGraphicFramePr>
+              <a:graphicFrameLocks xmlns:a="http://schemas.openxmlformats.org/drawingml/2006/main" noChangeAspect="1"/>
+            </wp:cNvGraphicFramePr>
+            <a:graphic xmlns:a="http://schemas.openxmlformats.org/drawingml/2006/main">
+              <a:graphicData uri="http://schemas.openxmlformats.org/drawingml/2006/picture">
+                <pic:pic xmlns:pic="http://schemas.openxmlformats.org/drawingml/2006/picture">
+                  <pic:nvPicPr>
+                    <pic:cNvPr id="106" name="Janela Alterar Imagem do Perfil"/>
+                    <pic:cNvPicPr/>
+                  </pic:nvPicPr>
+                  <pic:blipFill>
+                    <a:blip r:embed="rId26"/>
+                    <a:stretch>
+                      <a:fillRect/>
+                    </a:stretch>
+                  </pic:blipFill>
+                  <pic:spPr>
+                    <a:xfrm>
+                      <a:off x="0" y="0"/>
+                      <a:ext cx="5852160" cy="4114800"/>
+                    </a:xfrm>
+                    <a:prstGeom prst="rect">
+                      <a:avLst/>
+                    </a:prstGeom>
+                  </pic:spPr>
+                </pic:pic>
+              </a:graphicData>
+            </a:graphic>
+          </wp:inline>
+        </w:drawing>
+      </w:r>
+    </w:p>
+    <w:p>
+      <w:pPr>
+        <w:jc w:val="center"/>
         <w:rPr>
           <w:i/>
           <w:iCs/>
@@ -8722,7 +9075,26 @@
           <w:sz w:val="18"/>
           <w:szCs w:val="18"/>
         </w:rPr>
-        <w:t xml:space="preserve">Sem protótipo de tela para esta funcionalidade. Campos da funcionalidade:</w:t>
+        <w:t xml:space="preserve">Janela Alterar Imagem do Perfil</w:t>
+      </w:r>
+    </w:p>
+    <w:p>
+      <w:pPr>
+        <w:rPr>
+          <w:i/>
+          <w:iCs/>
+          <w:sz w:val="18"/>
+          <w:szCs w:val="18"/>
+        </w:rPr>
+      </w:pPr>
+      <w:r>
+        <w:rPr>
+          <w:i/>
+          <w:iCs/>
+          <w:sz w:val="18"/>
+          <w:szCs w:val="18"/>
+        </w:rPr>
+        <w:t xml:space="preserve">Campos da funcionalidade:</w:t>
       </w:r>
     </w:p>
     <w:tbl>
@@ -9927,6 +10299,49 @@
     </w:p>
     <w:p>
       <w:pPr>
+        <w:jc w:val="center"/>
+      </w:pPr>
+      <w:r>
+        <w:drawing>
+          <wp:inline distT="0" distB="0" distL="0" distR="0">
+            <wp:extent cx="5852160" cy="3200400"/>
+            <wp:effectExtent l="0" t="0" r="0" b="0"/>
+            <wp:docPr id="107" name="Tela inicial com o menu do usuário aberto"/>
+            <wp:cNvGraphicFramePr>
+              <a:graphicFrameLocks xmlns:a="http://schemas.openxmlformats.org/drawingml/2006/main" noChangeAspect="1"/>
+            </wp:cNvGraphicFramePr>
+            <a:graphic xmlns:a="http://schemas.openxmlformats.org/drawingml/2006/main">
+              <a:graphicData uri="http://schemas.openxmlformats.org/drawingml/2006/picture">
+                <pic:pic xmlns:pic="http://schemas.openxmlformats.org/drawingml/2006/picture">
+                  <pic:nvPicPr>
+                    <pic:cNvPr id="107" name="Tela inicial com o menu do usuário aberto"/>
+                    <pic:cNvPicPr/>
+                  </pic:nvPicPr>
+                  <pic:blipFill>
+                    <a:blip r:embed="rId27"/>
+                    <a:stretch>
+                      <a:fillRect/>
+                    </a:stretch>
+                  </pic:blipFill>
+                  <pic:spPr>
+                    <a:xfrm>
+                      <a:off x="0" y="0"/>
+                      <a:ext cx="5852160" cy="3200400"/>
+                    </a:xfrm>
+                    <a:prstGeom prst="rect">
+                      <a:avLst/>
+                    </a:prstGeom>
+                  </pic:spPr>
+                </pic:pic>
+              </a:graphicData>
+            </a:graphic>
+          </wp:inline>
+        </w:drawing>
+      </w:r>
+    </w:p>
+    <w:p>
+      <w:pPr>
+        <w:jc w:val="center"/>
         <w:rPr>
           <w:i/>
           <w:iCs/>
@@ -9941,7 +10356,26 @@
           <w:sz w:val="18"/>
           <w:szCs w:val="18"/>
         </w:rPr>
-        <w:t xml:space="preserve">Sem protótipo de tela para esta funcionalidade. Campos da funcionalidade:</w:t>
+        <w:t xml:space="preserve">Tela inicial com o menu do usuário aberto</w:t>
+      </w:r>
+    </w:p>
+    <w:p>
+      <w:pPr>
+        <w:rPr>
+          <w:i/>
+          <w:iCs/>
+          <w:sz w:val="18"/>
+          <w:szCs w:val="18"/>
+        </w:rPr>
+      </w:pPr>
+      <w:r>
+        <w:rPr>
+          <w:i/>
+          <w:iCs/>
+          <w:sz w:val="18"/>
+          <w:szCs w:val="18"/>
+        </w:rPr>
+        <w:t xml:space="preserve">Campos da funcionalidade:</w:t>
       </w:r>
     </w:p>
     <w:tbl>

</xml_diff>